<commit_message>
Schéma de base de données complet (9 tables avec FK et indexes)
</commit_message>
<xml_diff>
--- a/docs/04_MLD_Alur_Paris.docx
+++ b/docs/04_MLD_Alur_Paris.docx
@@ -45,12 +45,6 @@
         <w:gridCol w:w="6200"/>
       </w:tblGrid>
       <w:tr>
-        <w:tblPrEx>
-          <w:tblCellMar>
-            <w:top w:w="0" w:type="dxa"/>
-            <w:bottom w:w="0" w:type="dxa"/>
-          </w:tblCellMar>
-        </w:tblPrEx>
         <w:trPr>
           <w:tblHeader/>
         </w:trPr>
@@ -122,12 +116,6 @@
         </w:tc>
       </w:tr>
       <w:tr>
-        <w:tblPrEx>
-          <w:tblCellMar>
-            <w:top w:w="0" w:type="dxa"/>
-            <w:bottom w:w="0" w:type="dxa"/>
-          </w:tblCellMar>
-        </w:tblPrEx>
         <w:tc>
           <w:tcPr>
             <w:tcW w:w="2800" w:type="dxa"/>
@@ -190,12 +178,6 @@
         </w:tc>
       </w:tr>
       <w:tr>
-        <w:tblPrEx>
-          <w:tblCellMar>
-            <w:top w:w="0" w:type="dxa"/>
-            <w:bottom w:w="0" w:type="dxa"/>
-          </w:tblCellMar>
-        </w:tblPrEx>
         <w:tc>
           <w:tcPr>
             <w:tcW w:w="2800" w:type="dxa"/>
@@ -260,12 +242,6 @@
         </w:tc>
       </w:tr>
       <w:tr>
-        <w:tblPrEx>
-          <w:tblCellMar>
-            <w:top w:w="0" w:type="dxa"/>
-            <w:bottom w:w="0" w:type="dxa"/>
-          </w:tblCellMar>
-        </w:tblPrEx>
         <w:tc>
           <w:tcPr>
             <w:tcW w:w="2800" w:type="dxa"/>
@@ -328,12 +304,6 @@
         </w:tc>
       </w:tr>
       <w:tr>
-        <w:tblPrEx>
-          <w:tblCellMar>
-            <w:top w:w="0" w:type="dxa"/>
-            <w:bottom w:w="0" w:type="dxa"/>
-          </w:tblCellMar>
-        </w:tblPrEx>
         <w:tc>
           <w:tcPr>
             <w:tcW w:w="2800" w:type="dxa"/>
@@ -398,12 +368,6 @@
         </w:tc>
       </w:tr>
       <w:tr>
-        <w:tblPrEx>
-          <w:tblCellMar>
-            <w:top w:w="0" w:type="dxa"/>
-            <w:bottom w:w="0" w:type="dxa"/>
-          </w:tblCellMar>
-        </w:tblPrEx>
         <w:tc>
           <w:tcPr>
             <w:tcW w:w="2800" w:type="dxa"/>
@@ -587,12 +551,6 @@
         <w:gridCol w:w="3000"/>
       </w:tblGrid>
       <w:tr>
-        <w:tblPrEx>
-          <w:tblCellMar>
-            <w:top w:w="0" w:type="dxa"/>
-            <w:bottom w:w="0" w:type="dxa"/>
-          </w:tblCellMar>
-        </w:tblPrEx>
         <w:trPr>
           <w:tblHeader/>
         </w:trPr>
@@ -697,12 +655,6 @@
         </w:tc>
       </w:tr>
       <w:tr>
-        <w:tblPrEx>
-          <w:tblCellMar>
-            <w:top w:w="0" w:type="dxa"/>
-            <w:bottom w:w="0" w:type="dxa"/>
-          </w:tblCellMar>
-        </w:tblPrEx>
         <w:tc>
           <w:tcPr>
             <w:tcW w:w="2400" w:type="dxa"/>
@@ -833,12 +785,6 @@
         </w:tc>
       </w:tr>
       <w:tr>
-        <w:tblPrEx>
-          <w:tblCellMar>
-            <w:top w:w="0" w:type="dxa"/>
-            <w:bottom w:w="0" w:type="dxa"/>
-          </w:tblCellMar>
-        </w:tblPrEx>
         <w:tc>
           <w:tcPr>
             <w:tcW w:w="2400" w:type="dxa"/>
@@ -954,12 +900,6 @@
         </w:tc>
       </w:tr>
       <w:tr>
-        <w:tblPrEx>
-          <w:tblCellMar>
-            <w:top w:w="0" w:type="dxa"/>
-            <w:bottom w:w="0" w:type="dxa"/>
-          </w:tblCellMar>
-        </w:tblPrEx>
         <w:tc>
           <w:tcPr>
             <w:tcW w:w="2400" w:type="dxa"/>
@@ -1110,12 +1050,6 @@
         </w:tc>
       </w:tr>
       <w:tr>
-        <w:tblPrEx>
-          <w:tblCellMar>
-            <w:top w:w="0" w:type="dxa"/>
-            <w:bottom w:w="0" w:type="dxa"/>
-          </w:tblCellMar>
-        </w:tblPrEx>
         <w:tc>
           <w:tcPr>
             <w:tcW w:w="2400" w:type="dxa"/>
@@ -1241,12 +1175,6 @@
         </w:tc>
       </w:tr>
       <w:tr>
-        <w:tblPrEx>
-          <w:tblCellMar>
-            <w:top w:w="0" w:type="dxa"/>
-            <w:bottom w:w="0" w:type="dxa"/>
-          </w:tblCellMar>
-        </w:tblPrEx>
         <w:tc>
           <w:tcPr>
             <w:tcW w:w="2400" w:type="dxa"/>
@@ -1359,12 +1287,6 @@
         </w:tc>
       </w:tr>
       <w:tr>
-        <w:tblPrEx>
-          <w:tblCellMar>
-            <w:top w:w="0" w:type="dxa"/>
-            <w:bottom w:w="0" w:type="dxa"/>
-          </w:tblCellMar>
-        </w:tblPrEx>
         <w:tc>
           <w:tcPr>
             <w:tcW w:w="2400" w:type="dxa"/>
@@ -1480,12 +1402,6 @@
         </w:tc>
       </w:tr>
       <w:tr>
-        <w:tblPrEx>
-          <w:tblCellMar>
-            <w:top w:w="0" w:type="dxa"/>
-            <w:bottom w:w="0" w:type="dxa"/>
-          </w:tblCellMar>
-        </w:tblPrEx>
         <w:tc>
           <w:tcPr>
             <w:tcW w:w="2400" w:type="dxa"/>
@@ -1608,12 +1524,6 @@
         </w:tc>
       </w:tr>
       <w:tr>
-        <w:tblPrEx>
-          <w:tblCellMar>
-            <w:top w:w="0" w:type="dxa"/>
-            <w:bottom w:w="0" w:type="dxa"/>
-          </w:tblCellMar>
-        </w:tblPrEx>
         <w:tc>
           <w:tcPr>
             <w:tcW w:w="2400" w:type="dxa"/>
@@ -1741,12 +1651,6 @@
         </w:tc>
       </w:tr>
       <w:tr>
-        <w:tblPrEx>
-          <w:tblCellMar>
-            <w:top w:w="0" w:type="dxa"/>
-            <w:bottom w:w="0" w:type="dxa"/>
-          </w:tblCellMar>
-        </w:tblPrEx>
         <w:tc>
           <w:tcPr>
             <w:tcW w:w="2400" w:type="dxa"/>
@@ -1913,12 +1817,6 @@
         <w:gridCol w:w="1799"/>
       </w:tblGrid>
       <w:tr>
-        <w:tblPrEx>
-          <w:tblCellMar>
-            <w:top w:w="0" w:type="dxa"/>
-            <w:bottom w:w="0" w:type="dxa"/>
-          </w:tblCellMar>
-        </w:tblPrEx>
         <w:trPr>
           <w:tblHeader/>
         </w:trPr>
@@ -2057,12 +1955,6 @@
         </w:tc>
       </w:tr>
       <w:tr>
-        <w:tblPrEx>
-          <w:tblCellMar>
-            <w:top w:w="0" w:type="dxa"/>
-            <w:bottom w:w="0" w:type="dxa"/>
-          </w:tblCellMar>
-        </w:tblPrEx>
         <w:tc>
           <w:tcPr>
             <w:tcW w:w="2200" w:type="dxa"/>
@@ -2187,12 +2079,6 @@
         </w:tc>
       </w:tr>
       <w:tr>
-        <w:tblPrEx>
-          <w:tblCellMar>
-            <w:top w:w="0" w:type="dxa"/>
-            <w:bottom w:w="0" w:type="dxa"/>
-          </w:tblCellMar>
-        </w:tblPrEx>
         <w:tc>
           <w:tcPr>
             <w:tcW w:w="2200" w:type="dxa"/>
@@ -2341,12 +2227,6 @@
         </w:tc>
       </w:tr>
       <w:tr>
-        <w:tblPrEx>
-          <w:tblCellMar>
-            <w:top w:w="0" w:type="dxa"/>
-            <w:bottom w:w="0" w:type="dxa"/>
-          </w:tblCellMar>
-        </w:tblPrEx>
         <w:tc>
           <w:tcPr>
             <w:tcW w:w="2200" w:type="dxa"/>
@@ -2545,12 +2425,6 @@
         </w:tc>
       </w:tr>
       <w:tr>
-        <w:tblPrEx>
-          <w:tblCellMar>
-            <w:top w:w="0" w:type="dxa"/>
-            <w:bottom w:w="0" w:type="dxa"/>
-          </w:tblCellMar>
-        </w:tblPrEx>
         <w:tc>
           <w:tcPr>
             <w:tcW w:w="2200" w:type="dxa"/>
@@ -2689,12 +2563,6 @@
         </w:tc>
       </w:tr>
       <w:tr>
-        <w:tblPrEx>
-          <w:tblCellMar>
-            <w:top w:w="0" w:type="dxa"/>
-            <w:bottom w:w="0" w:type="dxa"/>
-          </w:tblCellMar>
-        </w:tblPrEx>
         <w:tc>
           <w:tcPr>
             <w:tcW w:w="2200" w:type="dxa"/>
@@ -2831,12 +2699,6 @@
         </w:tc>
       </w:tr>
       <w:tr>
-        <w:tblPrEx>
-          <w:tblCellMar>
-            <w:top w:w="0" w:type="dxa"/>
-            <w:bottom w:w="0" w:type="dxa"/>
-          </w:tblCellMar>
-        </w:tblPrEx>
         <w:tc>
           <w:tcPr>
             <w:tcW w:w="2200" w:type="dxa"/>
@@ -2977,12 +2839,6 @@
         </w:tc>
       </w:tr>
       <w:tr>
-        <w:tblPrEx>
-          <w:tblCellMar>
-            <w:top w:w="0" w:type="dxa"/>
-            <w:bottom w:w="0" w:type="dxa"/>
-          </w:tblCellMar>
-        </w:tblPrEx>
         <w:tc>
           <w:tcPr>
             <w:tcW w:w="2200" w:type="dxa"/>
@@ -3127,12 +2983,6 @@
         </w:tc>
       </w:tr>
       <w:tr>
-        <w:tblPrEx>
-          <w:tblCellMar>
-            <w:top w:w="0" w:type="dxa"/>
-            <w:bottom w:w="0" w:type="dxa"/>
-          </w:tblCellMar>
-        </w:tblPrEx>
         <w:tc>
           <w:tcPr>
             <w:tcW w:w="2200" w:type="dxa"/>
@@ -3271,12 +3121,6 @@
         </w:tc>
       </w:tr>
       <w:tr>
-        <w:tblPrEx>
-          <w:tblCellMar>
-            <w:top w:w="0" w:type="dxa"/>
-            <w:bottom w:w="0" w:type="dxa"/>
-          </w:tblCellMar>
-        </w:tblPrEx>
         <w:tc>
           <w:tcPr>
             <w:tcW w:w="2200" w:type="dxa"/>
@@ -3411,12 +3255,6 @@
         </w:tc>
       </w:tr>
       <w:tr>
-        <w:tblPrEx>
-          <w:tblCellMar>
-            <w:top w:w="0" w:type="dxa"/>
-            <w:bottom w:w="0" w:type="dxa"/>
-          </w:tblCellMar>
-        </w:tblPrEx>
         <w:tc>
           <w:tcPr>
             <w:tcW w:w="2200" w:type="dxa"/>
@@ -3555,12 +3393,6 @@
         </w:tc>
       </w:tr>
       <w:tr>
-        <w:tblPrEx>
-          <w:tblCellMar>
-            <w:top w:w="0" w:type="dxa"/>
-            <w:bottom w:w="0" w:type="dxa"/>
-          </w:tblCellMar>
-        </w:tblPrEx>
         <w:tc>
           <w:tcPr>
             <w:tcW w:w="2200" w:type="dxa"/>
@@ -3695,12 +3527,6 @@
         </w:tc>
       </w:tr>
       <w:tr>
-        <w:tblPrEx>
-          <w:tblCellMar>
-            <w:top w:w="0" w:type="dxa"/>
-            <w:bottom w:w="0" w:type="dxa"/>
-          </w:tblCellMar>
-        </w:tblPrEx>
         <w:tc>
           <w:tcPr>
             <w:tcW w:w="2200" w:type="dxa"/>
@@ -3922,12 +3748,6 @@
         <w:gridCol w:w="2121"/>
       </w:tblGrid>
       <w:tr>
-        <w:tblPrEx>
-          <w:tblCellMar>
-            <w:top w:w="0" w:type="dxa"/>
-            <w:bottom w:w="0" w:type="dxa"/>
-          </w:tblCellMar>
-        </w:tblPrEx>
         <w:trPr>
           <w:tblHeader/>
         </w:trPr>
@@ -4065,12 +3885,6 @@
         </w:tc>
       </w:tr>
       <w:tr>
-        <w:tblPrEx>
-          <w:tblCellMar>
-            <w:top w:w="0" w:type="dxa"/>
-            <w:bottom w:w="0" w:type="dxa"/>
-          </w:tblCellMar>
-        </w:tblPrEx>
         <w:tc>
           <w:tcPr>
             <w:tcW w:w="2200" w:type="dxa"/>
@@ -4187,12 +4001,6 @@
         </w:tc>
       </w:tr>
       <w:tr>
-        <w:tblPrEx>
-          <w:tblCellMar>
-            <w:top w:w="0" w:type="dxa"/>
-            <w:bottom w:w="0" w:type="dxa"/>
-          </w:tblCellMar>
-        </w:tblPrEx>
         <w:tc>
           <w:tcPr>
             <w:tcW w:w="2200" w:type="dxa"/>
@@ -4331,12 +4139,6 @@
         </w:tc>
       </w:tr>
       <w:tr>
-        <w:tblPrEx>
-          <w:tblCellMar>
-            <w:top w:w="0" w:type="dxa"/>
-            <w:bottom w:w="0" w:type="dxa"/>
-          </w:tblCellMar>
-        </w:tblPrEx>
         <w:tc>
           <w:tcPr>
             <w:tcW w:w="2200" w:type="dxa"/>
@@ -4471,12 +4273,6 @@
         </w:tc>
       </w:tr>
       <w:tr>
-        <w:tblPrEx>
-          <w:tblCellMar>
-            <w:top w:w="0" w:type="dxa"/>
-            <w:bottom w:w="0" w:type="dxa"/>
-          </w:tblCellMar>
-        </w:tblPrEx>
         <w:tc>
           <w:tcPr>
             <w:tcW w:w="2200" w:type="dxa"/>
@@ -4625,12 +4421,6 @@
         </w:tc>
       </w:tr>
       <w:tr>
-        <w:tblPrEx>
-          <w:tblCellMar>
-            <w:top w:w="0" w:type="dxa"/>
-            <w:bottom w:w="0" w:type="dxa"/>
-          </w:tblCellMar>
-        </w:tblPrEx>
         <w:tc>
           <w:tcPr>
             <w:tcW w:w="2200" w:type="dxa"/>
@@ -4768,12 +4558,6 @@
         </w:tc>
       </w:tr>
       <w:tr>
-        <w:tblPrEx>
-          <w:tblCellMar>
-            <w:top w:w="0" w:type="dxa"/>
-            <w:bottom w:w="0" w:type="dxa"/>
-          </w:tblCellMar>
-        </w:tblPrEx>
         <w:tc>
           <w:tcPr>
             <w:tcW w:w="2200" w:type="dxa"/>
@@ -4920,12 +4704,6 @@
         </w:tc>
       </w:tr>
       <w:tr>
-        <w:tblPrEx>
-          <w:tblCellMar>
-            <w:top w:w="0" w:type="dxa"/>
-            <w:bottom w:w="0" w:type="dxa"/>
-          </w:tblCellMar>
-        </w:tblPrEx>
         <w:tc>
           <w:tcPr>
             <w:tcW w:w="2200" w:type="dxa"/>
@@ -5068,12 +4846,6 @@
         </w:tc>
       </w:tr>
       <w:tr>
-        <w:tblPrEx>
-          <w:tblCellMar>
-            <w:top w:w="0" w:type="dxa"/>
-            <w:bottom w:w="0" w:type="dxa"/>
-          </w:tblCellMar>
-        </w:tblPrEx>
         <w:tc>
           <w:tcPr>
             <w:tcW w:w="2200" w:type="dxa"/>
@@ -5214,12 +4986,6 @@
         </w:tc>
       </w:tr>
       <w:tr>
-        <w:tblPrEx>
-          <w:tblCellMar>
-            <w:top w:w="0" w:type="dxa"/>
-            <w:bottom w:w="0" w:type="dxa"/>
-          </w:tblCellMar>
-        </w:tblPrEx>
         <w:tc>
           <w:tcPr>
             <w:tcW w:w="2200" w:type="dxa"/>
@@ -5346,12 +5112,6 @@
         </w:tc>
       </w:tr>
       <w:tr>
-        <w:tblPrEx>
-          <w:tblCellMar>
-            <w:top w:w="0" w:type="dxa"/>
-            <w:bottom w:w="0" w:type="dxa"/>
-          </w:tblCellMar>
-        </w:tblPrEx>
         <w:tc>
           <w:tcPr>
             <w:tcW w:w="2200" w:type="dxa"/>
@@ -5482,12 +5242,6 @@
         </w:tc>
       </w:tr>
       <w:tr>
-        <w:tblPrEx>
-          <w:tblCellMar>
-            <w:top w:w="0" w:type="dxa"/>
-            <w:bottom w:w="0" w:type="dxa"/>
-          </w:tblCellMar>
-        </w:tblPrEx>
         <w:tc>
           <w:tcPr>
             <w:tcW w:w="2200" w:type="dxa"/>
@@ -5624,12 +5378,6 @@
         </w:tc>
       </w:tr>
       <w:tr>
-        <w:tblPrEx>
-          <w:tblCellMar>
-            <w:top w:w="0" w:type="dxa"/>
-            <w:bottom w:w="0" w:type="dxa"/>
-          </w:tblCellMar>
-        </w:tblPrEx>
         <w:tc>
           <w:tcPr>
             <w:tcW w:w="2200" w:type="dxa"/>
@@ -5768,12 +5516,6 @@
         </w:tc>
       </w:tr>
       <w:tr>
-        <w:tblPrEx>
-          <w:tblCellMar>
-            <w:top w:w="0" w:type="dxa"/>
-            <w:bottom w:w="0" w:type="dxa"/>
-          </w:tblCellMar>
-        </w:tblPrEx>
         <w:tc>
           <w:tcPr>
             <w:tcW w:w="2200" w:type="dxa"/>
@@ -5962,12 +5704,6 @@
         <w:gridCol w:w="2200"/>
       </w:tblGrid>
       <w:tr>
-        <w:tblPrEx>
-          <w:tblCellMar>
-            <w:top w:w="0" w:type="dxa"/>
-            <w:bottom w:w="0" w:type="dxa"/>
-          </w:tblCellMar>
-        </w:tblPrEx>
         <w:trPr>
           <w:tblHeader/>
         </w:trPr>
@@ -6105,12 +5841,6 @@
         </w:tc>
       </w:tr>
       <w:tr>
-        <w:tblPrEx>
-          <w:tblCellMar>
-            <w:top w:w="0" w:type="dxa"/>
-            <w:bottom w:w="0" w:type="dxa"/>
-          </w:tblCellMar>
-        </w:tblPrEx>
         <w:tc>
           <w:tcPr>
             <w:tcW w:w="2200" w:type="dxa"/>
@@ -6227,12 +5957,6 @@
         </w:tc>
       </w:tr>
       <w:tr>
-        <w:tblPrEx>
-          <w:tblCellMar>
-            <w:top w:w="0" w:type="dxa"/>
-            <w:bottom w:w="0" w:type="dxa"/>
-          </w:tblCellMar>
-        </w:tblPrEx>
         <w:tc>
           <w:tcPr>
             <w:tcW w:w="2200" w:type="dxa"/>
@@ -6371,12 +6095,6 @@
         </w:tc>
       </w:tr>
       <w:tr>
-        <w:tblPrEx>
-          <w:tblCellMar>
-            <w:top w:w="0" w:type="dxa"/>
-            <w:bottom w:w="0" w:type="dxa"/>
-          </w:tblCellMar>
-        </w:tblPrEx>
         <w:tc>
           <w:tcPr>
             <w:tcW w:w="2200" w:type="dxa"/>
@@ -6521,12 +6239,6 @@
         </w:tc>
       </w:tr>
       <w:tr>
-        <w:tblPrEx>
-          <w:tblCellMar>
-            <w:top w:w="0" w:type="dxa"/>
-            <w:bottom w:w="0" w:type="dxa"/>
-          </w:tblCellMar>
-        </w:tblPrEx>
         <w:tc>
           <w:tcPr>
             <w:tcW w:w="2200" w:type="dxa"/>
@@ -6655,12 +6367,6 @@
         </w:tc>
       </w:tr>
       <w:tr>
-        <w:tblPrEx>
-          <w:tblCellMar>
-            <w:top w:w="0" w:type="dxa"/>
-            <w:bottom w:w="0" w:type="dxa"/>
-          </w:tblCellMar>
-        </w:tblPrEx>
         <w:tc>
           <w:tcPr>
             <w:tcW w:w="2200" w:type="dxa"/>
@@ -6841,12 +6547,6 @@
         <w:gridCol w:w="1579"/>
       </w:tblGrid>
       <w:tr>
-        <w:tblPrEx>
-          <w:tblCellMar>
-            <w:top w:w="0" w:type="dxa"/>
-            <w:bottom w:w="0" w:type="dxa"/>
-          </w:tblCellMar>
-        </w:tblPrEx>
         <w:trPr>
           <w:tblHeader/>
         </w:trPr>
@@ -6984,12 +6684,6 @@
         </w:tc>
       </w:tr>
       <w:tr>
-        <w:tblPrEx>
-          <w:tblCellMar>
-            <w:top w:w="0" w:type="dxa"/>
-            <w:bottom w:w="0" w:type="dxa"/>
-          </w:tblCellMar>
-        </w:tblPrEx>
         <w:tc>
           <w:tcPr>
             <w:tcW w:w="2200" w:type="dxa"/>
@@ -7106,12 +6800,6 @@
         </w:tc>
       </w:tr>
       <w:tr>
-        <w:tblPrEx>
-          <w:tblCellMar>
-            <w:top w:w="0" w:type="dxa"/>
-            <w:bottom w:w="0" w:type="dxa"/>
-          </w:tblCellMar>
-        </w:tblPrEx>
         <w:tc>
           <w:tcPr>
             <w:tcW w:w="2200" w:type="dxa"/>
@@ -7268,12 +6956,6 @@
         </w:tc>
       </w:tr>
       <w:tr>
-        <w:tblPrEx>
-          <w:tblCellMar>
-            <w:top w:w="0" w:type="dxa"/>
-            <w:bottom w:w="0" w:type="dxa"/>
-          </w:tblCellMar>
-        </w:tblPrEx>
         <w:tc>
           <w:tcPr>
             <w:tcW w:w="2200" w:type="dxa"/>
@@ -7408,12 +7090,6 @@
         </w:tc>
       </w:tr>
       <w:tr>
-        <w:tblPrEx>
-          <w:tblCellMar>
-            <w:top w:w="0" w:type="dxa"/>
-            <w:bottom w:w="0" w:type="dxa"/>
-          </w:tblCellMar>
-        </w:tblPrEx>
         <w:tc>
           <w:tcPr>
             <w:tcW w:w="2200" w:type="dxa"/>
@@ -7562,12 +7238,6 @@
         </w:tc>
       </w:tr>
       <w:tr>
-        <w:tblPrEx>
-          <w:tblCellMar>
-            <w:top w:w="0" w:type="dxa"/>
-            <w:bottom w:w="0" w:type="dxa"/>
-          </w:tblCellMar>
-        </w:tblPrEx>
         <w:tc>
           <w:tcPr>
             <w:tcW w:w="2200" w:type="dxa"/>
@@ -7702,12 +7372,6 @@
         </w:tc>
       </w:tr>
       <w:tr>
-        <w:tblPrEx>
-          <w:tblCellMar>
-            <w:top w:w="0" w:type="dxa"/>
-            <w:bottom w:w="0" w:type="dxa"/>
-          </w:tblCellMar>
-        </w:tblPrEx>
         <w:tc>
           <w:tcPr>
             <w:tcW w:w="2200" w:type="dxa"/>
@@ -7858,12 +7522,6 @@
         </w:tc>
       </w:tr>
       <w:tr>
-        <w:tblPrEx>
-          <w:tblCellMar>
-            <w:top w:w="0" w:type="dxa"/>
-            <w:bottom w:w="0" w:type="dxa"/>
-          </w:tblCellMar>
-        </w:tblPrEx>
         <w:tc>
           <w:tcPr>
             <w:tcW w:w="2200" w:type="dxa"/>
@@ -7998,12 +7656,6 @@
         </w:tc>
       </w:tr>
       <w:tr>
-        <w:tblPrEx>
-          <w:tblCellMar>
-            <w:top w:w="0" w:type="dxa"/>
-            <w:bottom w:w="0" w:type="dxa"/>
-          </w:tblCellMar>
-        </w:tblPrEx>
         <w:tc>
           <w:tcPr>
             <w:tcW w:w="2200" w:type="dxa"/>
@@ -8152,12 +7804,6 @@
         </w:tc>
       </w:tr>
       <w:tr>
-        <w:tblPrEx>
-          <w:tblCellMar>
-            <w:top w:w="0" w:type="dxa"/>
-            <w:bottom w:w="0" w:type="dxa"/>
-          </w:tblCellMar>
-        </w:tblPrEx>
         <w:tc>
           <w:tcPr>
             <w:tcW w:w="2200" w:type="dxa"/>
@@ -8302,12 +7948,6 @@
         </w:tc>
       </w:tr>
       <w:tr>
-        <w:tblPrEx>
-          <w:tblCellMar>
-            <w:top w:w="0" w:type="dxa"/>
-            <w:bottom w:w="0" w:type="dxa"/>
-          </w:tblCellMar>
-        </w:tblPrEx>
         <w:tc>
           <w:tcPr>
             <w:tcW w:w="2200" w:type="dxa"/>
@@ -8456,12 +8096,6 @@
         </w:tc>
       </w:tr>
       <w:tr>
-        <w:tblPrEx>
-          <w:tblCellMar>
-            <w:top w:w="0" w:type="dxa"/>
-            <w:bottom w:w="0" w:type="dxa"/>
-          </w:tblCellMar>
-        </w:tblPrEx>
         <w:tc>
           <w:tcPr>
             <w:tcW w:w="2200" w:type="dxa"/>
@@ -8606,12 +8240,6 @@
         </w:tc>
       </w:tr>
       <w:tr>
-        <w:tblPrEx>
-          <w:tblCellMar>
-            <w:top w:w="0" w:type="dxa"/>
-            <w:bottom w:w="0" w:type="dxa"/>
-          </w:tblCellMar>
-        </w:tblPrEx>
         <w:tc>
           <w:tcPr>
             <w:tcW w:w="2200" w:type="dxa"/>
@@ -8750,12 +8378,6 @@
         </w:tc>
       </w:tr>
       <w:tr>
-        <w:tblPrEx>
-          <w:tblCellMar>
-            <w:top w:w="0" w:type="dxa"/>
-            <w:bottom w:w="0" w:type="dxa"/>
-          </w:tblCellMar>
-        </w:tblPrEx>
         <w:tc>
           <w:tcPr>
             <w:tcW w:w="2200" w:type="dxa"/>
@@ -8900,12 +8522,6 @@
         </w:tc>
       </w:tr>
       <w:tr>
-        <w:tblPrEx>
-          <w:tblCellMar>
-            <w:top w:w="0" w:type="dxa"/>
-            <w:bottom w:w="0" w:type="dxa"/>
-          </w:tblCellMar>
-        </w:tblPrEx>
         <w:tc>
           <w:tcPr>
             <w:tcW w:w="2200" w:type="dxa"/>
@@ -9054,12 +8670,6 @@
         </w:tc>
       </w:tr>
       <w:tr>
-        <w:tblPrEx>
-          <w:tblCellMar>
-            <w:top w:w="0" w:type="dxa"/>
-            <w:bottom w:w="0" w:type="dxa"/>
-          </w:tblCellMar>
-        </w:tblPrEx>
         <w:tc>
           <w:tcPr>
             <w:tcW w:w="2200" w:type="dxa"/>
@@ -9184,12 +8794,6 @@
         </w:tc>
       </w:tr>
       <w:tr>
-        <w:tblPrEx>
-          <w:tblCellMar>
-            <w:top w:w="0" w:type="dxa"/>
-            <w:bottom w:w="0" w:type="dxa"/>
-          </w:tblCellMar>
-        </w:tblPrEx>
         <w:tc>
           <w:tcPr>
             <w:tcW w:w="2200" w:type="dxa"/>
@@ -9328,12 +8932,6 @@
         </w:tc>
       </w:tr>
       <w:tr>
-        <w:tblPrEx>
-          <w:tblCellMar>
-            <w:top w:w="0" w:type="dxa"/>
-            <w:bottom w:w="0" w:type="dxa"/>
-          </w:tblCellMar>
-        </w:tblPrEx>
         <w:tc>
           <w:tcPr>
             <w:tcW w:w="2200" w:type="dxa"/>
@@ -9468,12 +9066,6 @@
         </w:tc>
       </w:tr>
       <w:tr>
-        <w:tblPrEx>
-          <w:tblCellMar>
-            <w:top w:w="0" w:type="dxa"/>
-            <w:bottom w:w="0" w:type="dxa"/>
-          </w:tblCellMar>
-        </w:tblPrEx>
         <w:tc>
           <w:tcPr>
             <w:tcW w:w="2200" w:type="dxa"/>
@@ -9604,12 +9196,6 @@
         </w:tc>
       </w:tr>
       <w:tr>
-        <w:tblPrEx>
-          <w:tblCellMar>
-            <w:top w:w="0" w:type="dxa"/>
-            <w:bottom w:w="0" w:type="dxa"/>
-          </w:tblCellMar>
-        </w:tblPrEx>
         <w:tc>
           <w:tcPr>
             <w:tcW w:w="2200" w:type="dxa"/>
@@ -9736,12 +9322,6 @@
         </w:tc>
       </w:tr>
       <w:tr>
-        <w:tblPrEx>
-          <w:tblCellMar>
-            <w:top w:w="0" w:type="dxa"/>
-            <w:bottom w:w="0" w:type="dxa"/>
-          </w:tblCellMar>
-        </w:tblPrEx>
         <w:tc>
           <w:tcPr>
             <w:tcW w:w="2200" w:type="dxa"/>
@@ -9984,12 +9564,6 @@
         <w:gridCol w:w="2200"/>
       </w:tblGrid>
       <w:tr>
-        <w:tblPrEx>
-          <w:tblCellMar>
-            <w:top w:w="0" w:type="dxa"/>
-            <w:bottom w:w="0" w:type="dxa"/>
-          </w:tblCellMar>
-        </w:tblPrEx>
         <w:trPr>
           <w:tblHeader/>
         </w:trPr>
@@ -10127,12 +9701,6 @@
         </w:tc>
       </w:tr>
       <w:tr>
-        <w:tblPrEx>
-          <w:tblCellMar>
-            <w:top w:w="0" w:type="dxa"/>
-            <w:bottom w:w="0" w:type="dxa"/>
-          </w:tblCellMar>
-        </w:tblPrEx>
         <w:tc>
           <w:tcPr>
             <w:tcW w:w="2200" w:type="dxa"/>
@@ -10249,12 +9817,6 @@
         </w:tc>
       </w:tr>
       <w:tr>
-        <w:tblPrEx>
-          <w:tblCellMar>
-            <w:top w:w="0" w:type="dxa"/>
-            <w:bottom w:w="0" w:type="dxa"/>
-          </w:tblCellMar>
-        </w:tblPrEx>
         <w:tc>
           <w:tcPr>
             <w:tcW w:w="2200" w:type="dxa"/>
@@ -10385,12 +9947,6 @@
         </w:tc>
       </w:tr>
       <w:tr>
-        <w:tblPrEx>
-          <w:tblCellMar>
-            <w:top w:w="0" w:type="dxa"/>
-            <w:bottom w:w="0" w:type="dxa"/>
-          </w:tblCellMar>
-        </w:tblPrEx>
         <w:tc>
           <w:tcPr>
             <w:tcW w:w="2200" w:type="dxa"/>
@@ -10553,12 +10109,6 @@
         </w:tc>
       </w:tr>
       <w:tr>
-        <w:tblPrEx>
-          <w:tblCellMar>
-            <w:top w:w="0" w:type="dxa"/>
-            <w:bottom w:w="0" w:type="dxa"/>
-          </w:tblCellMar>
-        </w:tblPrEx>
         <w:tc>
           <w:tcPr>
             <w:tcW w:w="2200" w:type="dxa"/>
@@ -10707,12 +10257,6 @@
         </w:tc>
       </w:tr>
       <w:tr>
-        <w:tblPrEx>
-          <w:tblCellMar>
-            <w:top w:w="0" w:type="dxa"/>
-            <w:bottom w:w="0" w:type="dxa"/>
-          </w:tblCellMar>
-        </w:tblPrEx>
         <w:tc>
           <w:tcPr>
             <w:tcW w:w="2200" w:type="dxa"/>
@@ -10847,12 +10391,6 @@
         </w:tc>
       </w:tr>
       <w:tr>
-        <w:tblPrEx>
-          <w:tblCellMar>
-            <w:top w:w="0" w:type="dxa"/>
-            <w:bottom w:w="0" w:type="dxa"/>
-          </w:tblCellMar>
-        </w:tblPrEx>
         <w:tc>
           <w:tcPr>
             <w:tcW w:w="2200" w:type="dxa"/>
@@ -11045,12 +10583,6 @@
         <w:gridCol w:w="2200"/>
       </w:tblGrid>
       <w:tr>
-        <w:tblPrEx>
-          <w:tblCellMar>
-            <w:top w:w="0" w:type="dxa"/>
-            <w:bottom w:w="0" w:type="dxa"/>
-          </w:tblCellMar>
-        </w:tblPrEx>
         <w:trPr>
           <w:tblHeader/>
         </w:trPr>
@@ -11188,12 +10720,6 @@
         </w:tc>
       </w:tr>
       <w:tr>
-        <w:tblPrEx>
-          <w:tblCellMar>
-            <w:top w:w="0" w:type="dxa"/>
-            <w:bottom w:w="0" w:type="dxa"/>
-          </w:tblCellMar>
-        </w:tblPrEx>
         <w:tc>
           <w:tcPr>
             <w:tcW w:w="2200" w:type="dxa"/>
@@ -11310,12 +10836,6 @@
         </w:tc>
       </w:tr>
       <w:tr>
-        <w:tblPrEx>
-          <w:tblCellMar>
-            <w:top w:w="0" w:type="dxa"/>
-            <w:bottom w:w="0" w:type="dxa"/>
-          </w:tblCellMar>
-        </w:tblPrEx>
         <w:tc>
           <w:tcPr>
             <w:tcW w:w="2200" w:type="dxa"/>
@@ -11482,12 +11002,6 @@
         </w:tc>
       </w:tr>
       <w:tr>
-        <w:tblPrEx>
-          <w:tblCellMar>
-            <w:top w:w="0" w:type="dxa"/>
-            <w:bottom w:w="0" w:type="dxa"/>
-          </w:tblCellMar>
-        </w:tblPrEx>
         <w:tc>
           <w:tcPr>
             <w:tcW w:w="2200" w:type="dxa"/>
@@ -11622,12 +11136,6 @@
         </w:tc>
       </w:tr>
       <w:tr>
-        <w:tblPrEx>
-          <w:tblCellMar>
-            <w:top w:w="0" w:type="dxa"/>
-            <w:bottom w:w="0" w:type="dxa"/>
-          </w:tblCellMar>
-        </w:tblPrEx>
         <w:tc>
           <w:tcPr>
             <w:tcW w:w="2200" w:type="dxa"/>
@@ -11776,12 +11284,6 @@
         </w:tc>
       </w:tr>
       <w:tr>
-        <w:tblPrEx>
-          <w:tblCellMar>
-            <w:top w:w="0" w:type="dxa"/>
-            <w:bottom w:w="0" w:type="dxa"/>
-          </w:tblCellMar>
-        </w:tblPrEx>
         <w:tc>
           <w:tcPr>
             <w:tcW w:w="2200" w:type="dxa"/>
@@ -11941,12 +11443,6 @@
         <w:gridCol w:w="1800"/>
       </w:tblGrid>
       <w:tr>
-        <w:tblPrEx>
-          <w:tblCellMar>
-            <w:top w:w="0" w:type="dxa"/>
-            <w:bottom w:w="0" w:type="dxa"/>
-          </w:tblCellMar>
-        </w:tblPrEx>
         <w:trPr>
           <w:tblHeader/>
         </w:trPr>
@@ -12105,12 +11601,6 @@
         </w:tc>
       </w:tr>
       <w:tr>
-        <w:tblPrEx>
-          <w:tblCellMar>
-            <w:top w:w="0" w:type="dxa"/>
-            <w:bottom w:w="0" w:type="dxa"/>
-          </w:tblCellMar>
-        </w:tblPrEx>
         <w:tc>
           <w:tcPr>
             <w:tcW w:w="2400" w:type="dxa"/>
@@ -12235,12 +11725,6 @@
         </w:tc>
       </w:tr>
       <w:tr>
-        <w:tblPrEx>
-          <w:tblCellMar>
-            <w:top w:w="0" w:type="dxa"/>
-            <w:bottom w:w="0" w:type="dxa"/>
-          </w:tblCellMar>
-        </w:tblPrEx>
         <w:tc>
           <w:tcPr>
             <w:tcW w:w="2400" w:type="dxa"/>
@@ -12379,12 +11863,6 @@
         </w:tc>
       </w:tr>
       <w:tr>
-        <w:tblPrEx>
-          <w:tblCellMar>
-            <w:top w:w="0" w:type="dxa"/>
-            <w:bottom w:w="0" w:type="dxa"/>
-          </w:tblCellMar>
-        </w:tblPrEx>
         <w:tc>
           <w:tcPr>
             <w:tcW w:w="2400" w:type="dxa"/>
@@ -12511,12 +11989,6 @@
         </w:tc>
       </w:tr>
       <w:tr>
-        <w:tblPrEx>
-          <w:tblCellMar>
-            <w:top w:w="0" w:type="dxa"/>
-            <w:bottom w:w="0" w:type="dxa"/>
-          </w:tblCellMar>
-        </w:tblPrEx>
         <w:tc>
           <w:tcPr>
             <w:tcW w:w="2400" w:type="dxa"/>
@@ -12647,12 +12119,6 @@
         </w:tc>
       </w:tr>
       <w:tr>
-        <w:tblPrEx>
-          <w:tblCellMar>
-            <w:top w:w="0" w:type="dxa"/>
-            <w:bottom w:w="0" w:type="dxa"/>
-          </w:tblCellMar>
-        </w:tblPrEx>
         <w:tc>
           <w:tcPr>
             <w:tcW w:w="2400" w:type="dxa"/>
@@ -12825,12 +12291,6 @@
         <w:gridCol w:w="1200"/>
       </w:tblGrid>
       <w:tr>
-        <w:tblPrEx>
-          <w:tblCellMar>
-            <w:top w:w="0" w:type="dxa"/>
-            <w:bottom w:w="0" w:type="dxa"/>
-          </w:tblCellMar>
-        </w:tblPrEx>
         <w:trPr>
           <w:tblHeader/>
         </w:trPr>
@@ -12968,12 +12428,6 @@
         </w:tc>
       </w:tr>
       <w:tr>
-        <w:tblPrEx>
-          <w:tblCellMar>
-            <w:top w:w="0" w:type="dxa"/>
-            <w:bottom w:w="0" w:type="dxa"/>
-          </w:tblCellMar>
-        </w:tblPrEx>
         <w:tc>
           <w:tcPr>
             <w:tcW w:w="2400" w:type="dxa"/>
@@ -13090,12 +12544,6 @@
         </w:tc>
       </w:tr>
       <w:tr>
-        <w:tblPrEx>
-          <w:tblCellMar>
-            <w:top w:w="0" w:type="dxa"/>
-            <w:bottom w:w="0" w:type="dxa"/>
-          </w:tblCellMar>
-        </w:tblPrEx>
         <w:tc>
           <w:tcPr>
             <w:tcW w:w="2400" w:type="dxa"/>
@@ -13244,12 +12692,6 @@
         </w:tc>
       </w:tr>
       <w:tr>
-        <w:tblPrEx>
-          <w:tblCellMar>
-            <w:top w:w="0" w:type="dxa"/>
-            <w:bottom w:w="0" w:type="dxa"/>
-          </w:tblCellMar>
-        </w:tblPrEx>
         <w:tc>
           <w:tcPr>
             <w:tcW w:w="2400" w:type="dxa"/>
@@ -13384,12 +12826,6 @@
         </w:tc>
       </w:tr>
       <w:tr>
-        <w:tblPrEx>
-          <w:tblCellMar>
-            <w:top w:w="0" w:type="dxa"/>
-            <w:bottom w:w="0" w:type="dxa"/>
-          </w:tblCellMar>
-        </w:tblPrEx>
         <w:tc>
           <w:tcPr>
             <w:tcW w:w="2400" w:type="dxa"/>
@@ -13548,12 +12984,6 @@
         </w:tc>
       </w:tr>
       <w:tr>
-        <w:tblPrEx>
-          <w:tblCellMar>
-            <w:top w:w="0" w:type="dxa"/>
-            <w:bottom w:w="0" w:type="dxa"/>
-          </w:tblCellMar>
-        </w:tblPrEx>
         <w:tc>
           <w:tcPr>
             <w:tcW w:w="2400" w:type="dxa"/>
@@ -13708,12 +13138,6 @@
         </w:tc>
       </w:tr>
       <w:tr>
-        <w:tblPrEx>
-          <w:tblCellMar>
-            <w:top w:w="0" w:type="dxa"/>
-            <w:bottom w:w="0" w:type="dxa"/>
-          </w:tblCellMar>
-        </w:tblPrEx>
         <w:tc>
           <w:tcPr>
             <w:tcW w:w="2400" w:type="dxa"/>
@@ -13872,12 +13296,6 @@
         </w:tc>
       </w:tr>
       <w:tr>
-        <w:tblPrEx>
-          <w:tblCellMar>
-            <w:top w:w="0" w:type="dxa"/>
-            <w:bottom w:w="0" w:type="dxa"/>
-          </w:tblCellMar>
-        </w:tblPrEx>
         <w:tc>
           <w:tcPr>
             <w:tcW w:w="2400" w:type="dxa"/>
@@ -14030,12 +13448,6 @@
         </w:tc>
       </w:tr>
       <w:tr>
-        <w:tblPrEx>
-          <w:tblCellMar>
-            <w:top w:w="0" w:type="dxa"/>
-            <w:bottom w:w="0" w:type="dxa"/>
-          </w:tblCellMar>
-        </w:tblPrEx>
         <w:tc>
           <w:tcPr>
             <w:tcW w:w="2400" w:type="dxa"/>
@@ -14184,12 +13596,6 @@
         </w:tc>
       </w:tr>
       <w:tr>
-        <w:tblPrEx>
-          <w:tblCellMar>
-            <w:top w:w="0" w:type="dxa"/>
-            <w:bottom w:w="0" w:type="dxa"/>
-          </w:tblCellMar>
-        </w:tblPrEx>
         <w:tc>
           <w:tcPr>
             <w:tcW w:w="2400" w:type="dxa"/>
@@ -14326,12 +13732,6 @@
         </w:tc>
       </w:tr>
       <w:tr>
-        <w:tblPrEx>
-          <w:tblCellMar>
-            <w:top w:w="0" w:type="dxa"/>
-            <w:bottom w:w="0" w:type="dxa"/>
-          </w:tblCellMar>
-        </w:tblPrEx>
         <w:tc>
           <w:tcPr>
             <w:tcW w:w="2400" w:type="dxa"/>
@@ -14472,12 +13872,6 @@
         </w:tc>
       </w:tr>
       <w:tr>
-        <w:tblPrEx>
-          <w:tblCellMar>
-            <w:top w:w="0" w:type="dxa"/>
-            <w:bottom w:w="0" w:type="dxa"/>
-          </w:tblCellMar>
-        </w:tblPrEx>
         <w:tc>
           <w:tcPr>
             <w:tcW w:w="2400" w:type="dxa"/>
@@ -14622,12 +14016,6 @@
         </w:tc>
       </w:tr>
       <w:tr>
-        <w:tblPrEx>
-          <w:tblCellMar>
-            <w:top w:w="0" w:type="dxa"/>
-            <w:bottom w:w="0" w:type="dxa"/>
-          </w:tblCellMar>
-        </w:tblPrEx>
         <w:tc>
           <w:tcPr>
             <w:tcW w:w="2400" w:type="dxa"/>
@@ -14776,12 +14164,6 @@
         </w:tc>
       </w:tr>
       <w:tr>
-        <w:tblPrEx>
-          <w:tblCellMar>
-            <w:top w:w="0" w:type="dxa"/>
-            <w:bottom w:w="0" w:type="dxa"/>
-          </w:tblCellMar>
-        </w:tblPrEx>
         <w:tc>
           <w:tcPr>
             <w:tcW w:w="2400" w:type="dxa"/>
@@ -14918,12 +14300,6 @@
         </w:tc>
       </w:tr>
       <w:tr>
-        <w:tblPrEx>
-          <w:tblCellMar>
-            <w:top w:w="0" w:type="dxa"/>
-            <w:bottom w:w="0" w:type="dxa"/>
-          </w:tblCellMar>
-        </w:tblPrEx>
         <w:tc>
           <w:tcPr>
             <w:tcW w:w="2400" w:type="dxa"/>
@@ -15062,12 +14438,6 @@
         </w:tc>
       </w:tr>
       <w:tr>
-        <w:tblPrEx>
-          <w:tblCellMar>
-            <w:top w:w="0" w:type="dxa"/>
-            <w:bottom w:w="0" w:type="dxa"/>
-          </w:tblCellMar>
-        </w:tblPrEx>
         <w:tc>
           <w:tcPr>
             <w:tcW w:w="2400" w:type="dxa"/>
@@ -15202,12 +14572,6 @@
         </w:tc>
       </w:tr>
       <w:tr>
-        <w:tblPrEx>
-          <w:tblCellMar>
-            <w:top w:w="0" w:type="dxa"/>
-            <w:bottom w:w="0" w:type="dxa"/>
-          </w:tblCellMar>
-        </w:tblPrEx>
         <w:tc>
           <w:tcPr>
             <w:tcW w:w="2400" w:type="dxa"/>
@@ -15348,12 +14712,6 @@
         </w:tc>
       </w:tr>
       <w:tr>
-        <w:tblPrEx>
-          <w:tblCellMar>
-            <w:top w:w="0" w:type="dxa"/>
-            <w:bottom w:w="0" w:type="dxa"/>
-          </w:tblCellMar>
-        </w:tblPrEx>
         <w:tc>
           <w:tcPr>
             <w:tcW w:w="2400" w:type="dxa"/>
@@ -15491,12 +14849,6 @@
         </w:tc>
       </w:tr>
       <w:tr>
-        <w:tblPrEx>
-          <w:tblCellMar>
-            <w:top w:w="0" w:type="dxa"/>
-            <w:bottom w:w="0" w:type="dxa"/>
-          </w:tblCellMar>
-        </w:tblPrEx>
         <w:tc>
           <w:tcPr>
             <w:tcW w:w="2400" w:type="dxa"/>
@@ -15637,12 +14989,6 @@
         </w:tc>
       </w:tr>
       <w:tr>
-        <w:tblPrEx>
-          <w:tblCellMar>
-            <w:top w:w="0" w:type="dxa"/>
-            <w:bottom w:w="0" w:type="dxa"/>
-          </w:tblCellMar>
-        </w:tblPrEx>
         <w:tc>
           <w:tcPr>
             <w:tcW w:w="2400" w:type="dxa"/>
@@ -15779,12 +15125,6 @@
         </w:tc>
       </w:tr>
       <w:tr>
-        <w:tblPrEx>
-          <w:tblCellMar>
-            <w:top w:w="0" w:type="dxa"/>
-            <w:bottom w:w="0" w:type="dxa"/>
-          </w:tblCellMar>
-        </w:tblPrEx>
         <w:tc>
           <w:tcPr>
             <w:tcW w:w="2400" w:type="dxa"/>
@@ -15933,12 +15273,6 @@
         </w:tc>
       </w:tr>
       <w:tr>
-        <w:tblPrEx>
-          <w:tblCellMar>
-            <w:top w:w="0" w:type="dxa"/>
-            <w:bottom w:w="0" w:type="dxa"/>
-          </w:tblCellMar>
-        </w:tblPrEx>
         <w:tc>
           <w:tcPr>
             <w:tcW w:w="2400" w:type="dxa"/>
@@ -16131,12 +15465,6 @@
         </w:tc>
       </w:tr>
       <w:tr>
-        <w:tblPrEx>
-          <w:tblCellMar>
-            <w:top w:w="0" w:type="dxa"/>
-            <w:bottom w:w="0" w:type="dxa"/>
-          </w:tblCellMar>
-        </w:tblPrEx>
         <w:tc>
           <w:tcPr>
             <w:tcW w:w="2400" w:type="dxa"/>
@@ -16275,12 +15603,6 @@
         </w:tc>
       </w:tr>
       <w:tr>
-        <w:tblPrEx>
-          <w:tblCellMar>
-            <w:top w:w="0" w:type="dxa"/>
-            <w:bottom w:w="0" w:type="dxa"/>
-          </w:tblCellMar>
-        </w:tblPrEx>
         <w:tc>
           <w:tcPr>
             <w:tcW w:w="2400" w:type="dxa"/>
@@ -16415,12 +15737,6 @@
         </w:tc>
       </w:tr>
       <w:tr>
-        <w:tblPrEx>
-          <w:tblCellMar>
-            <w:top w:w="0" w:type="dxa"/>
-            <w:bottom w:w="0" w:type="dxa"/>
-          </w:tblCellMar>
-        </w:tblPrEx>
         <w:tc>
           <w:tcPr>
             <w:tcW w:w="2400" w:type="dxa"/>
@@ -16551,12 +15867,6 @@
         </w:tc>
       </w:tr>
       <w:tr>
-        <w:tblPrEx>
-          <w:tblCellMar>
-            <w:top w:w="0" w:type="dxa"/>
-            <w:bottom w:w="0" w:type="dxa"/>
-          </w:tblCellMar>
-        </w:tblPrEx>
         <w:tc>
           <w:tcPr>
             <w:tcW w:w="2400" w:type="dxa"/>
@@ -16820,12 +16130,6 @@
         <w:gridCol w:w="2200"/>
       </w:tblGrid>
       <w:tr>
-        <w:tblPrEx>
-          <w:tblCellMar>
-            <w:top w:w="0" w:type="dxa"/>
-            <w:bottom w:w="0" w:type="dxa"/>
-          </w:tblCellMar>
-        </w:tblPrEx>
         <w:trPr>
           <w:tblHeader/>
         </w:trPr>
@@ -16963,12 +16267,6 @@
         </w:tc>
       </w:tr>
       <w:tr>
-        <w:tblPrEx>
-          <w:tblCellMar>
-            <w:top w:w="0" w:type="dxa"/>
-            <w:bottom w:w="0" w:type="dxa"/>
-          </w:tblCellMar>
-        </w:tblPrEx>
         <w:tc>
           <w:tcPr>
             <w:tcW w:w="2200" w:type="dxa"/>
@@ -17085,12 +16383,6 @@
         </w:tc>
       </w:tr>
       <w:tr>
-        <w:tblPrEx>
-          <w:tblCellMar>
-            <w:top w:w="0" w:type="dxa"/>
-            <w:bottom w:w="0" w:type="dxa"/>
-          </w:tblCellMar>
-        </w:tblPrEx>
         <w:tc>
           <w:tcPr>
             <w:tcW w:w="2200" w:type="dxa"/>
@@ -17221,12 +16513,6 @@
         </w:tc>
       </w:tr>
       <w:tr>
-        <w:tblPrEx>
-          <w:tblCellMar>
-            <w:top w:w="0" w:type="dxa"/>
-            <w:bottom w:w="0" w:type="dxa"/>
-          </w:tblCellMar>
-        </w:tblPrEx>
         <w:tc>
           <w:tcPr>
             <w:tcW w:w="2200" w:type="dxa"/>
@@ -17354,12 +16640,6 @@
         </w:tc>
       </w:tr>
       <w:tr>
-        <w:tblPrEx>
-          <w:tblCellMar>
-            <w:top w:w="0" w:type="dxa"/>
-            <w:bottom w:w="0" w:type="dxa"/>
-          </w:tblCellMar>
-        </w:tblPrEx>
         <w:tc>
           <w:tcPr>
             <w:tcW w:w="2200" w:type="dxa"/>
@@ -17508,12 +16788,6 @@
         </w:tc>
       </w:tr>
       <w:tr>
-        <w:tblPrEx>
-          <w:tblCellMar>
-            <w:top w:w="0" w:type="dxa"/>
-            <w:bottom w:w="0" w:type="dxa"/>
-          </w:tblCellMar>
-        </w:tblPrEx>
         <w:tc>
           <w:tcPr>
             <w:tcW w:w="2200" w:type="dxa"/>
@@ -17648,12 +16922,6 @@
         </w:tc>
       </w:tr>
       <w:tr>
-        <w:tblPrEx>
-          <w:tblCellMar>
-            <w:top w:w="0" w:type="dxa"/>
-            <w:bottom w:w="0" w:type="dxa"/>
-          </w:tblCellMar>
-        </w:tblPrEx>
         <w:tc>
           <w:tcPr>
             <w:tcW w:w="2200" w:type="dxa"/>
@@ -17802,12 +17070,6 @@
         </w:tc>
       </w:tr>
       <w:tr>
-        <w:tblPrEx>
-          <w:tblCellMar>
-            <w:top w:w="0" w:type="dxa"/>
-            <w:bottom w:w="0" w:type="dxa"/>
-          </w:tblCellMar>
-        </w:tblPrEx>
         <w:tc>
           <w:tcPr>
             <w:tcW w:w="2200" w:type="dxa"/>
@@ -17952,12 +17214,6 @@
         </w:tc>
       </w:tr>
       <w:tr>
-        <w:tblPrEx>
-          <w:tblCellMar>
-            <w:top w:w="0" w:type="dxa"/>
-            <w:bottom w:w="0" w:type="dxa"/>
-          </w:tblCellMar>
-        </w:tblPrEx>
         <w:tc>
           <w:tcPr>
             <w:tcW w:w="2200" w:type="dxa"/>
@@ -18106,12 +17362,6 @@
         </w:tc>
       </w:tr>
       <w:tr>
-        <w:tblPrEx>
-          <w:tblCellMar>
-            <w:top w:w="0" w:type="dxa"/>
-            <w:bottom w:w="0" w:type="dxa"/>
-          </w:tblCellMar>
-        </w:tblPrEx>
         <w:tc>
           <w:tcPr>
             <w:tcW w:w="2200" w:type="dxa"/>
@@ -18230,12 +17480,6 @@
         </w:tc>
       </w:tr>
       <w:tr>
-        <w:tblPrEx>
-          <w:tblCellMar>
-            <w:top w:w="0" w:type="dxa"/>
-            <w:bottom w:w="0" w:type="dxa"/>
-          </w:tblCellMar>
-        </w:tblPrEx>
         <w:tc>
           <w:tcPr>
             <w:tcW w:w="2200" w:type="dxa"/>
@@ -18406,12 +17650,6 @@
         </w:tc>
       </w:tr>
       <w:tr>
-        <w:tblPrEx>
-          <w:tblCellMar>
-            <w:top w:w="0" w:type="dxa"/>
-            <w:bottom w:w="0" w:type="dxa"/>
-          </w:tblCellMar>
-        </w:tblPrEx>
         <w:tc>
           <w:tcPr>
             <w:tcW w:w="2200" w:type="dxa"/>
@@ -18707,12 +17945,6 @@
         <w:gridCol w:w="2153"/>
       </w:tblGrid>
       <w:tr>
-        <w:tblPrEx>
-          <w:tblCellMar>
-            <w:top w:w="0" w:type="dxa"/>
-            <w:bottom w:w="0" w:type="dxa"/>
-          </w:tblCellMar>
-        </w:tblPrEx>
         <w:trPr>
           <w:tblHeader/>
         </w:trPr>
@@ -18850,12 +18082,6 @@
         </w:tc>
       </w:tr>
       <w:tr>
-        <w:tblPrEx>
-          <w:tblCellMar>
-            <w:top w:w="0" w:type="dxa"/>
-            <w:bottom w:w="0" w:type="dxa"/>
-          </w:tblCellMar>
-        </w:tblPrEx>
         <w:tc>
           <w:tcPr>
             <w:tcW w:w="2200" w:type="dxa"/>
@@ -18972,12 +18198,6 @@
         </w:tc>
       </w:tr>
       <w:tr>
-        <w:tblPrEx>
-          <w:tblCellMar>
-            <w:top w:w="0" w:type="dxa"/>
-            <w:bottom w:w="0" w:type="dxa"/>
-          </w:tblCellMar>
-        </w:tblPrEx>
         <w:tc>
           <w:tcPr>
             <w:tcW w:w="2200" w:type="dxa"/>
@@ -19108,12 +18328,6 @@
         </w:tc>
       </w:tr>
       <w:tr>
-        <w:tblPrEx>
-          <w:tblCellMar>
-            <w:top w:w="0" w:type="dxa"/>
-            <w:bottom w:w="0" w:type="dxa"/>
-          </w:tblCellMar>
-        </w:tblPrEx>
         <w:tc>
           <w:tcPr>
             <w:tcW w:w="2200" w:type="dxa"/>
@@ -19240,12 +18454,6 @@
         </w:tc>
       </w:tr>
       <w:tr>
-        <w:tblPrEx>
-          <w:tblCellMar>
-            <w:top w:w="0" w:type="dxa"/>
-            <w:bottom w:w="0" w:type="dxa"/>
-          </w:tblCellMar>
-        </w:tblPrEx>
         <w:tc>
           <w:tcPr>
             <w:tcW w:w="2200" w:type="dxa"/>
@@ -19376,12 +18584,6 @@
         </w:tc>
       </w:tr>
       <w:tr>
-        <w:tblPrEx>
-          <w:tblCellMar>
-            <w:top w:w="0" w:type="dxa"/>
-            <w:bottom w:w="0" w:type="dxa"/>
-          </w:tblCellMar>
-        </w:tblPrEx>
         <w:tc>
           <w:tcPr>
             <w:tcW w:w="2200" w:type="dxa"/>
@@ -19498,12 +18700,6 @@
         </w:tc>
       </w:tr>
       <w:tr>
-        <w:tblPrEx>
-          <w:tblCellMar>
-            <w:top w:w="0" w:type="dxa"/>
-            <w:bottom w:w="0" w:type="dxa"/>
-          </w:tblCellMar>
-        </w:tblPrEx>
         <w:tc>
           <w:tcPr>
             <w:tcW w:w="2200" w:type="dxa"/>
@@ -19642,12 +18838,6 @@
         </w:tc>
       </w:tr>
       <w:tr>
-        <w:tblPrEx>
-          <w:tblCellMar>
-            <w:top w:w="0" w:type="dxa"/>
-            <w:bottom w:w="0" w:type="dxa"/>
-          </w:tblCellMar>
-        </w:tblPrEx>
         <w:tc>
           <w:tcPr>
             <w:tcW w:w="2200" w:type="dxa"/>
@@ -19820,12 +19010,6 @@
         <w:gridCol w:w="4700"/>
       </w:tblGrid>
       <w:tr>
-        <w:tblPrEx>
-          <w:tblCellMar>
-            <w:top w:w="0" w:type="dxa"/>
-            <w:bottom w:w="0" w:type="dxa"/>
-          </w:tblCellMar>
-        </w:tblPrEx>
         <w:trPr>
           <w:tblHeader/>
         </w:trPr>
@@ -19930,12 +19114,6 @@
         </w:tc>
       </w:tr>
       <w:tr>
-        <w:tblPrEx>
-          <w:tblCellMar>
-            <w:top w:w="0" w:type="dxa"/>
-            <w:bottom w:w="0" w:type="dxa"/>
-          </w:tblCellMar>
-        </w:tblPrEx>
         <w:tc>
           <w:tcPr>
             <w:tcW w:w="2800" w:type="dxa"/>
@@ -20038,12 +19216,6 @@
         </w:tc>
       </w:tr>
       <w:tr>
-        <w:tblPrEx>
-          <w:tblCellMar>
-            <w:top w:w="0" w:type="dxa"/>
-            <w:bottom w:w="0" w:type="dxa"/>
-          </w:tblCellMar>
-        </w:tblPrEx>
         <w:tc>
           <w:tcPr>
             <w:tcW w:w="2800" w:type="dxa"/>
@@ -20167,12 +19339,6 @@
         </w:tc>
       </w:tr>
       <w:tr>
-        <w:tblPrEx>
-          <w:tblCellMar>
-            <w:top w:w="0" w:type="dxa"/>
-            <w:bottom w:w="0" w:type="dxa"/>
-          </w:tblCellMar>
-        </w:tblPrEx>
         <w:tc>
           <w:tcPr>
             <w:tcW w:w="2800" w:type="dxa"/>
@@ -20277,12 +19443,6 @@
         </w:tc>
       </w:tr>
       <w:tr>
-        <w:tblPrEx>
-          <w:tblCellMar>
-            <w:top w:w="0" w:type="dxa"/>
-            <w:bottom w:w="0" w:type="dxa"/>
-          </w:tblCellMar>
-        </w:tblPrEx>
         <w:tc>
           <w:tcPr>
             <w:tcW w:w="2800" w:type="dxa"/>
@@ -20398,12 +19558,6 @@
         </w:tc>
       </w:tr>
       <w:tr>
-        <w:tblPrEx>
-          <w:tblCellMar>
-            <w:top w:w="0" w:type="dxa"/>
-            <w:bottom w:w="0" w:type="dxa"/>
-          </w:tblCellMar>
-        </w:tblPrEx>
         <w:tc>
           <w:tcPr>
             <w:tcW w:w="2800" w:type="dxa"/>
@@ -20534,12 +19688,6 @@
         </w:tc>
       </w:tr>
       <w:tr>
-        <w:tblPrEx>
-          <w:tblCellMar>
-            <w:top w:w="0" w:type="dxa"/>
-            <w:bottom w:w="0" w:type="dxa"/>
-          </w:tblCellMar>
-        </w:tblPrEx>
         <w:tc>
           <w:tcPr>
             <w:tcW w:w="2800" w:type="dxa"/>
@@ -20655,12 +19803,6 @@
         </w:tc>
       </w:tr>
       <w:tr>
-        <w:tblPrEx>
-          <w:tblCellMar>
-            <w:top w:w="0" w:type="dxa"/>
-            <w:bottom w:w="0" w:type="dxa"/>
-          </w:tblCellMar>
-        </w:tblPrEx>
         <w:tc>
           <w:tcPr>
             <w:tcW w:w="2800" w:type="dxa"/>
@@ -20778,22 +19920,41 @@
         <w:pStyle w:val="Titre1"/>
       </w:pPr>
       <w:r>
-        <w:rPr>
-          <w:noProof/>
-        </w:rPr>
+        <w:t xml:space="preserve">5. </w:t>
+      </w:r>
+      <w:r>
+        <w:t>Diagramme ERD final</w:t>
+      </w:r>
+      <w:r>
+        <w:t xml:space="preserve"> (</w:t>
+      </w:r>
+      <w:proofErr w:type="spellStart"/>
+      <w:r>
+        <w:t>phpmyadmin</w:t>
+      </w:r>
+      <w:proofErr w:type="spellEnd"/>
+      <w:r>
+        <w:t>)</w:t>
+      </w:r>
+    </w:p>
+    <w:p>
+      <w:pPr>
+        <w:pStyle w:val="Titre1"/>
+      </w:pPr>
+      <w:r>
         <w:drawing>
-          <wp:anchor distT="0" distB="0" distL="114300" distR="114300" simplePos="0" relativeHeight="251658240" behindDoc="1" locked="0" layoutInCell="1" allowOverlap="1" wp14:anchorId="457554DE" wp14:editId="13E831BD">
+          <wp:anchor distT="0" distB="0" distL="114300" distR="114300" simplePos="0" relativeHeight="251658240" behindDoc="1" locked="0" layoutInCell="1" allowOverlap="1" wp14:anchorId="56F81D7F" wp14:editId="0E6C73C1">
             <wp:simplePos x="0" y="0"/>
             <wp:positionH relativeFrom="margin">
-              <wp:align>left</wp:align>
+              <wp:align>center</wp:align>
             </wp:positionH>
             <wp:positionV relativeFrom="paragraph">
-              <wp:posOffset>558165</wp:posOffset>
+              <wp:posOffset>151855</wp:posOffset>
             </wp:positionV>
-            <wp:extent cx="5715000" cy="5638800"/>
-            <wp:effectExtent l="0" t="0" r="0" b="0"/>
+            <wp:extent cx="6606891" cy="3897085"/>
+            <wp:effectExtent l="0" t="0" r="3810" b="8255"/>
             <wp:wrapNone/>
-            <wp:docPr id="627737396" name="Image 2"/>
+            <wp:docPr id="1286857723" name="Image 1"/>
             <wp:cNvGraphicFramePr>
               <a:graphicFrameLocks xmlns:a="http://schemas.openxmlformats.org/drawingml/2006/main" noChangeAspect="1"/>
             </wp:cNvGraphicFramePr>
@@ -20801,10 +19962,8 @@
               <a:graphicData uri="http://schemas.openxmlformats.org/drawingml/2006/picture">
                 <pic:pic xmlns:pic="http://schemas.openxmlformats.org/drawingml/2006/picture">
                   <pic:nvPicPr>
-                    <pic:cNvPr id="0" name="Picture 2"/>
-                    <pic:cNvPicPr>
-                      <a:picLocks noChangeAspect="1" noChangeArrowheads="1"/>
-                    </pic:cNvPicPr>
+                    <pic:cNvPr id="1286857723" name=""/>
+                    <pic:cNvPicPr/>
                   </pic:nvPicPr>
                   <pic:blipFill>
                     <a:blip r:embed="rId7" cstate="print">
@@ -20814,23 +19973,18 @@
                         </a:ext>
                       </a:extLst>
                     </a:blip>
-                    <a:srcRect/>
                     <a:stretch>
                       <a:fillRect/>
                     </a:stretch>
                   </pic:blipFill>
-                  <pic:spPr bwMode="auto">
+                  <pic:spPr>
                     <a:xfrm>
                       <a:off x="0" y="0"/>
-                      <a:ext cx="5715000" cy="5638800"/>
+                      <a:ext cx="6606891" cy="3897085"/>
                     </a:xfrm>
                     <a:prstGeom prst="rect">
                       <a:avLst/>
                     </a:prstGeom>
-                    <a:noFill/>
-                    <a:ln>
-                      <a:noFill/>
-                    </a:ln>
                   </pic:spPr>
                 </pic:pic>
               </a:graphicData>
@@ -20838,17 +19992,6 @@
           </wp:anchor>
         </w:drawing>
       </w:r>
-      <w:r>
-        <w:t xml:space="preserve">5. </w:t>
-      </w:r>
-      <w:r>
-        <w:t>Diagramme ERD final</w:t>
-      </w:r>
-    </w:p>
-    <w:p>
-      <w:pPr>
-        <w:spacing w:after="120" w:line="300" w:lineRule="auto"/>
-      </w:pPr>
     </w:p>
     <w:sectPr>
       <w:headerReference w:type="default" r:id="rId8"/>
@@ -21745,6 +20888,7 @@
   <w:style w:type="character" w:default="1" w:styleId="Policepardfaut">
     <w:name w:val="Default Paragraph Font"/>
     <w:uiPriority w:val="1"/>
+    <w:semiHidden/>
     <w:unhideWhenUsed/>
   </w:style>
   <w:style w:type="table" w:default="1" w:styleId="TableauNormal">

</xml_diff>